<commit_message>
feat(preprint): add figure cross-references and rebuild the release assets
</commit_message>
<xml_diff>
--- a/dist/PACSP-ID-7.0.0-preprint.docx
+++ b/dist/PACSP-ID-7.0.0-preprint.docx
@@ -9219,7 +9219,7 @@
           <w:rFonts w:ascii="Cambria" w:hAnsi="Cambria" w:eastAsia="SimSun"/>
           <w:sz w:val="21"/>
         </w:rPr>
-        <w:t xml:space="preserve"> 均值随认知负荷严格递增（0.1272 &lt; 0.1677 &lt; 0.3352），与 §5.3 的论断方向一致。</w:t>
+        <w:t xml:space="preserve"> 均值随认知负荷严格递增（0.1272 &lt; 0.1677 &lt; 0.3352），与 §5.3 的论断方向一致。 各域的路径增量与认知强度曲线见图 F.1、F.5、F.9（人机交互三域）。</w:t>
       </w:r>
     </w:p>
     <w:p>
@@ -9753,7 +9753,7 @@
           <w:rFonts w:ascii="Cambria" w:hAnsi="Cambria" w:eastAsia="SimSun"/>
           <w:sz w:val="21"/>
         </w:rPr>
-        <w:t>， 不改变原有测量语义。情绪树深度上诗歌为 2、歌词与技术文档为 1：深度由通道间条件概率 结构决定而非序列长度，短文本的情绪表征更集中，反而形成更深的层级。</w:t>
+        <w:t>， 不改变原有测量语义。情绪树深度上诗歌为 2、歌词与技术文档为 1：深度由通道间条件概率 结构决定而非序列长度，短文本的情绪表征更集中，反而形成更深的层级。 三域的瑟-树耦合分解见图 F.4、F.8、F.12。</w:t>
       </w:r>
     </w:p>
     <w:p>
@@ -10408,6 +10408,19 @@
       <w:pPr>
         <w:spacing w:after="120"/>
       </w:pPr>
+    </w:p>
+    <w:p>
+      <w:pPr>
+        <w:spacing w:after="80" w:line="307" w:lineRule="auto"/>
+        <w:ind w:firstLine="420"/>
+      </w:pPr>
+      <w:r>
+        <w:rPr>
+          <w:rFonts w:ascii="Cambria" w:hAnsi="Cambria" w:eastAsia="SimSun"/>
+          <w:sz w:val="21"/>
+        </w:rPr>
+        <w:t>三域的五元分解构成与四个判定系数见图 F.3、F.7、F.11。</w:t>
+      </w:r>
     </w:p>
     <w:p>
       <w:pPr>
@@ -11740,7 +11753,7 @@
           <w:rFonts w:ascii="Cambria" w:hAnsi="Cambria" w:eastAsia="SimSun"/>
           <w:sz w:val="21"/>
         </w:rPr>
-        <w:t>。</w:t>
+        <w:t>。 六个域的完整对照见附录F：人机交互三域为图 F.1–F.12，自主生成三域为图 F.13–F.24，跨域汇总见图 F.25 与图 F.26。</w:t>
       </w:r>
     </w:p>
     <w:p>
@@ -12467,7 +12480,21 @@
           <w:rFonts w:ascii="Cambria" w:hAnsi="Cambria" w:eastAsia="SimSun"/>
           <w:sz w:val="21"/>
         </w:rPr>
-        <w:t>，§8.4 需据此修订。</w:t>
+        <w:t xml:space="preserve">，§8.4 需据此修订。 本节的跨嵌入对比数据来源见 </w:t>
+      </w:r>
+      <w:r>
+        <w:rPr>
+          <w:rFonts w:ascii="Consolas" w:hAnsi="Consolas" w:eastAsia="SimSun"/>
+          <w:sz w:val="20"/>
+        </w:rPr>
+        <w:t>docs/CONSISTENCY-REPORT.md</w:t>
+      </w:r>
+      <w:r>
+        <w:rPr>
+          <w:rFonts w:ascii="Cambria" w:hAnsi="Cambria" w:eastAsia="SimSun"/>
+          <w:sz w:val="21"/>
+        </w:rPr>
+        <w:t>。</w:t>
       </w:r>
     </w:p>
     <w:p>

</xml_diff>